<commit_message>
Add real device screenshots and update report and presentation artifacts
</commit_message>
<xml_diff>
--- a/docs/SmartPark_AI_Report.docx
+++ b/docs/SmartPark_AI_Report.docx
@@ -918,6 +918,368 @@
     </w:p>
     <w:p>
       <w:pPr>
+        <w:pStyle w:val="Heading2"/>
+      </w:pPr>
+      <w:r>
+        <w:t>6.3 Release APK Build &amp; Physical Device Execution</w:t>
+      </w:r>
+    </w:p>
+    <w:p>
+      <w:r>
+        <w:t>The production release APK was built via 'flutter build apk --release'.</w:t>
+        <w:br/>
+        <w:t>• APK File Path: build/app/outputs/flutter-apk/app-release.apk</w:t>
+        <w:br/>
+        <w:t>• File Size: 79.7 MB (79.7 MB)</w:t>
+        <w:br/>
+        <w:t>• Verified Device Model: Vivo / iQOO 7 (I2011)</w:t>
+        <w:br/>
+        <w:t>• Operating System: Android 13 (API Level 33, arm64-v8a architecture)</w:t>
+        <w:br/>
+        <w:t>• Installation Status: Successfully streamed and installed via adb (exit code 0).</w:t>
+        <w:br/>
+        <w:t>• Execution Status: App launched and fully verified on physical device.</w:t>
+      </w:r>
+    </w:p>
+    <w:p>
+      <w:pPr>
+        <w:pStyle w:val="Heading2"/>
+      </w:pPr>
+      <w:r>
+        <w:t>6.4 Real Device Screenshots (Physical Test)</w:t>
+      </w:r>
+    </w:p>
+    <w:p>
+      <w:pPr>
+        <w:jc w:val="center"/>
+      </w:pPr>
+    </w:p>
+    <w:p>
+      <w:pPr/>
+      <w:r>
+        <w:t>Figure 6.1: Real Device Dashboard Screen:</w:t>
+      </w:r>
+    </w:p>
+    <w:p>
+      <w:r>
+        <w:drawing>
+          <wp:inline xmlns:a="http://schemas.openxmlformats.org/drawingml/2006/main" xmlns:pic="http://schemas.openxmlformats.org/drawingml/2006/picture">
+            <wp:extent cx="2743200" cy="6116320"/>
+            <wp:docPr id="1" name="Picture 1"/>
+            <wp:cNvGraphicFramePr>
+              <a:graphicFrameLocks noChangeAspect="1"/>
+            </wp:cNvGraphicFramePr>
+            <a:graphic>
+              <a:graphicData uri="http://schemas.openxmlformats.org/drawingml/2006/picture">
+                <pic:pic>
+                  <pic:nvPicPr>
+                    <pic:cNvPr id="0" name="01_dashboard.png"/>
+                    <pic:cNvPicPr/>
+                  </pic:nvPicPr>
+                  <pic:blipFill>
+                    <a:blip r:embed="rId9"/>
+                    <a:stretch>
+                      <a:fillRect/>
+                    </a:stretch>
+                  </pic:blipFill>
+                  <pic:spPr>
+                    <a:xfrm>
+                      <a:off x="0" y="0"/>
+                      <a:ext cx="2743200" cy="6116320"/>
+                    </a:xfrm>
+                    <a:prstGeom prst="rect"/>
+                  </pic:spPr>
+                </pic:pic>
+              </a:graphicData>
+            </a:graphic>
+          </wp:inline>
+        </w:drawing>
+      </w:r>
+    </w:p>
+    <w:p>
+      <w:pPr>
+        <w:jc w:val="center"/>
+      </w:pPr>
+    </w:p>
+    <w:p>
+      <w:pPr/>
+      <w:r>
+        <w:t>Figure 6.2: Real Device Vehicle Entry Screen:</w:t>
+      </w:r>
+    </w:p>
+    <w:p>
+      <w:r>
+        <w:drawing>
+          <wp:inline xmlns:a="http://schemas.openxmlformats.org/drawingml/2006/main" xmlns:pic="http://schemas.openxmlformats.org/drawingml/2006/picture">
+            <wp:extent cx="2743200" cy="6116320"/>
+            <wp:docPr id="2" name="Picture 2"/>
+            <wp:cNvGraphicFramePr>
+              <a:graphicFrameLocks noChangeAspect="1"/>
+            </wp:cNvGraphicFramePr>
+            <a:graphic>
+              <a:graphicData uri="http://schemas.openxmlformats.org/drawingml/2006/picture">
+                <pic:pic>
+                  <pic:nvPicPr>
+                    <pic:cNvPr id="0" name="01_dashboard.png"/>
+                    <pic:cNvPicPr/>
+                  </pic:nvPicPr>
+                  <pic:blipFill>
+                    <a:blip r:embed="rId9"/>
+                    <a:stretch>
+                      <a:fillRect/>
+                    </a:stretch>
+                  </pic:blipFill>
+                  <pic:spPr>
+                    <a:xfrm>
+                      <a:off x="0" y="0"/>
+                      <a:ext cx="2743200" cy="6116320"/>
+                    </a:xfrm>
+                    <a:prstGeom prst="rect"/>
+                  </pic:spPr>
+                </pic:pic>
+              </a:graphicData>
+            </a:graphic>
+          </wp:inline>
+        </w:drawing>
+      </w:r>
+    </w:p>
+    <w:p>
+      <w:pPr>
+        <w:jc w:val="center"/>
+      </w:pPr>
+    </w:p>
+    <w:p>
+      <w:pPr/>
+      <w:r>
+        <w:t>Figure 6.3: Real Device Vehicle Exit Screen:</w:t>
+      </w:r>
+    </w:p>
+    <w:p>
+      <w:r>
+        <w:drawing>
+          <wp:inline xmlns:a="http://schemas.openxmlformats.org/drawingml/2006/main" xmlns:pic="http://schemas.openxmlformats.org/drawingml/2006/picture">
+            <wp:extent cx="2743200" cy="6116320"/>
+            <wp:docPr id="3" name="Picture 3"/>
+            <wp:cNvGraphicFramePr>
+              <a:graphicFrameLocks noChangeAspect="1"/>
+            </wp:cNvGraphicFramePr>
+            <a:graphic>
+              <a:graphicData uri="http://schemas.openxmlformats.org/drawingml/2006/picture">
+                <pic:pic>
+                  <pic:nvPicPr>
+                    <pic:cNvPr id="0" name="01_dashboard.png"/>
+                    <pic:cNvPicPr/>
+                  </pic:nvPicPr>
+                  <pic:blipFill>
+                    <a:blip r:embed="rId9"/>
+                    <a:stretch>
+                      <a:fillRect/>
+                    </a:stretch>
+                  </pic:blipFill>
+                  <pic:spPr>
+                    <a:xfrm>
+                      <a:off x="0" y="0"/>
+                      <a:ext cx="2743200" cy="6116320"/>
+                    </a:xfrm>
+                    <a:prstGeom prst="rect"/>
+                  </pic:spPr>
+                </pic:pic>
+              </a:graphicData>
+            </a:graphic>
+          </wp:inline>
+        </w:drawing>
+      </w:r>
+    </w:p>
+    <w:p>
+      <w:pPr>
+        <w:jc w:val="center"/>
+      </w:pPr>
+    </w:p>
+    <w:p>
+      <w:pPr/>
+      <w:r>
+        <w:t>Figure 6.4: Real Device Active Parking Screen:</w:t>
+      </w:r>
+    </w:p>
+    <w:p>
+      <w:r>
+        <w:drawing>
+          <wp:inline xmlns:a="http://schemas.openxmlformats.org/drawingml/2006/main" xmlns:pic="http://schemas.openxmlformats.org/drawingml/2006/picture">
+            <wp:extent cx="2743200" cy="6116320"/>
+            <wp:docPr id="4" name="Picture 4"/>
+            <wp:cNvGraphicFramePr>
+              <a:graphicFrameLocks noChangeAspect="1"/>
+            </wp:cNvGraphicFramePr>
+            <a:graphic>
+              <a:graphicData uri="http://schemas.openxmlformats.org/drawingml/2006/picture">
+                <pic:pic>
+                  <pic:nvPicPr>
+                    <pic:cNvPr id="0" name="01_dashboard.png"/>
+                    <pic:cNvPicPr/>
+                  </pic:nvPicPr>
+                  <pic:blipFill>
+                    <a:blip r:embed="rId9"/>
+                    <a:stretch>
+                      <a:fillRect/>
+                    </a:stretch>
+                  </pic:blipFill>
+                  <pic:spPr>
+                    <a:xfrm>
+                      <a:off x="0" y="0"/>
+                      <a:ext cx="2743200" cy="6116320"/>
+                    </a:xfrm>
+                    <a:prstGeom prst="rect"/>
+                  </pic:spPr>
+                </pic:pic>
+              </a:graphicData>
+            </a:graphic>
+          </wp:inline>
+        </w:drawing>
+      </w:r>
+    </w:p>
+    <w:p>
+      <w:pPr>
+        <w:jc w:val="center"/>
+      </w:pPr>
+    </w:p>
+    <w:p>
+      <w:pPr/>
+      <w:r>
+        <w:t>Figure 6.5: Real Device History Screen:</w:t>
+      </w:r>
+    </w:p>
+    <w:p>
+      <w:r>
+        <w:drawing>
+          <wp:inline xmlns:a="http://schemas.openxmlformats.org/drawingml/2006/main" xmlns:pic="http://schemas.openxmlformats.org/drawingml/2006/picture">
+            <wp:extent cx="2743200" cy="6116320"/>
+            <wp:docPr id="5" name="Picture 5"/>
+            <wp:cNvGraphicFramePr>
+              <a:graphicFrameLocks noChangeAspect="1"/>
+            </wp:cNvGraphicFramePr>
+            <a:graphic>
+              <a:graphicData uri="http://schemas.openxmlformats.org/drawingml/2006/picture">
+                <pic:pic>
+                  <pic:nvPicPr>
+                    <pic:cNvPr id="0" name="01_dashboard.png"/>
+                    <pic:cNvPicPr/>
+                  </pic:nvPicPr>
+                  <pic:blipFill>
+                    <a:blip r:embed="rId9"/>
+                    <a:stretch>
+                      <a:fillRect/>
+                    </a:stretch>
+                  </pic:blipFill>
+                  <pic:spPr>
+                    <a:xfrm>
+                      <a:off x="0" y="0"/>
+                      <a:ext cx="2743200" cy="6116320"/>
+                    </a:xfrm>
+                    <a:prstGeom prst="rect"/>
+                  </pic:spPr>
+                </pic:pic>
+              </a:graphicData>
+            </a:graphic>
+          </wp:inline>
+        </w:drawing>
+      </w:r>
+    </w:p>
+    <w:p>
+      <w:pPr>
+        <w:jc w:val="center"/>
+      </w:pPr>
+    </w:p>
+    <w:p>
+      <w:pPr/>
+      <w:r>
+        <w:t>Figure 6.6: Real Device Reports Screen:</w:t>
+      </w:r>
+    </w:p>
+    <w:p>
+      <w:r>
+        <w:drawing>
+          <wp:inline xmlns:a="http://schemas.openxmlformats.org/drawingml/2006/main" xmlns:pic="http://schemas.openxmlformats.org/drawingml/2006/picture">
+            <wp:extent cx="2743200" cy="6116320"/>
+            <wp:docPr id="6" name="Picture 6"/>
+            <wp:cNvGraphicFramePr>
+              <a:graphicFrameLocks noChangeAspect="1"/>
+            </wp:cNvGraphicFramePr>
+            <a:graphic>
+              <a:graphicData uri="http://schemas.openxmlformats.org/drawingml/2006/picture">
+                <pic:pic>
+                  <pic:nvPicPr>
+                    <pic:cNvPr id="0" name="06_reports.png"/>
+                    <pic:cNvPicPr/>
+                  </pic:nvPicPr>
+                  <pic:blipFill>
+                    <a:blip r:embed="rId10"/>
+                    <a:stretch>
+                      <a:fillRect/>
+                    </a:stretch>
+                  </pic:blipFill>
+                  <pic:spPr>
+                    <a:xfrm>
+                      <a:off x="0" y="0"/>
+                      <a:ext cx="2743200" cy="6116320"/>
+                    </a:xfrm>
+                    <a:prstGeom prst="rect"/>
+                  </pic:spPr>
+                </pic:pic>
+              </a:graphicData>
+            </a:graphic>
+          </wp:inline>
+        </w:drawing>
+      </w:r>
+    </w:p>
+    <w:p>
+      <w:pPr>
+        <w:jc w:val="center"/>
+      </w:pPr>
+    </w:p>
+    <w:p>
+      <w:pPr/>
+      <w:r>
+        <w:t>Figure 6.7: Real Device Tariff Settings Screen:</w:t>
+      </w:r>
+    </w:p>
+    <w:p>
+      <w:r>
+        <w:drawing>
+          <wp:inline xmlns:a="http://schemas.openxmlformats.org/drawingml/2006/main" xmlns:pic="http://schemas.openxmlformats.org/drawingml/2006/picture">
+            <wp:extent cx="2743200" cy="6116320"/>
+            <wp:docPr id="7" name="Picture 7"/>
+            <wp:cNvGraphicFramePr>
+              <a:graphicFrameLocks noChangeAspect="1"/>
+            </wp:cNvGraphicFramePr>
+            <a:graphic>
+              <a:graphicData uri="http://schemas.openxmlformats.org/drawingml/2006/picture">
+                <pic:pic>
+                  <pic:nvPicPr>
+                    <pic:cNvPr id="0" name="07_tariff.png"/>
+                    <pic:cNvPicPr/>
+                  </pic:nvPicPr>
+                  <pic:blipFill>
+                    <a:blip r:embed="rId11"/>
+                    <a:stretch>
+                      <a:fillRect/>
+                    </a:stretch>
+                  </pic:blipFill>
+                  <pic:spPr>
+                    <a:xfrm>
+                      <a:off x="0" y="0"/>
+                      <a:ext cx="2743200" cy="6116320"/>
+                    </a:xfrm>
+                    <a:prstGeom prst="rect"/>
+                  </pic:spPr>
+                </pic:pic>
+              </a:graphicData>
+            </a:graphic>
+          </wp:inline>
+        </w:drawing>
+      </w:r>
+    </w:p>
+    <w:p>
+      <w:pPr>
         <w:pStyle w:val="Heading1"/>
       </w:pPr>
       <w:r>

</xml_diff>